<commit_message>
Update resume files and LinkedIn URL
Co-Authored-By: Claude Opus 4.6 <noreply@anthropic.com>
</commit_message>
<xml_diff>
--- a/Kim_Julongbayan_Resume.docx
+++ b/Kim_Julongbayan_Resume.docx
@@ -38,7 +38,7 @@
           <w:sz w:val="20"/>
           <w:szCs w:val="20"/>
         </w:rPr>
-        <w:t>Quezon City, Metro Manila, Philippines | kljulongbayan@gmail.com | https://github.com/kimlj | linkedin.com/in/kim-julongbayan-82b8b51b9 | +639615299305</w:t>
+        <w:t>Quezon City, Metro Manila, Philippines | kljulongbayan@gmail.com | https://github.com/kimlj | linkedin.com/in/kimjulongbayan | +639615299305</w:t>
       </w:r>
     </w:p>
     <w:p>
@@ -54,15 +54,7 @@
         <w:spacing w:after="200"/>
       </w:pPr>
       <w:r>
-        <w:t xml:space="preserve">Detail-oriented Full-Stack Developer with 7+ years of experience in mobile/web development, AI/ML integration, cloud infrastructure, and blockchain applications. Extensive hands-on experience with generative AI tools including LLMs, image generation (Stable Diffusion, </w:t>
-      </w:r>
-      <w:proofErr w:type="spellStart"/>
-      <w:r>
-        <w:t>ComfyUI</w:t>
-      </w:r>
-      <w:proofErr w:type="spellEnd"/>
-      <w:r>
-        <w:t>), and video generation. Proficient in DevOps practices including Docker containerization, VPS management, and cloud deployment. Strong analytical mindset with expertise in prompt engineering, AI workflow automation, and ensuring output quality.</w:t>
+        <w:t>Detail-oriented Full-Stack Developer with 7+ years of experience in mobile/web development, AI/ML integration, cloud infrastructure, and blockchain applications. Extensive hands-on experience with generative AI tools including LLMs, image generation (Stable Diffusion, ComfyUI), and video generation. Proficient in DevOps practices including Docker containerization, VPS management, and cloud deployment. Strong analytical mindset with expertise in prompt engineering, AI workflow automation, and ensuring output quality.</w:t>
       </w:r>
     </w:p>
     <w:p>
@@ -95,12 +87,6 @@
         <w:gridCol w:w="8221"/>
       </w:tblGrid>
       <w:tr>
-        <w:tblPrEx>
-          <w:tblCellMar>
-            <w:top w:w="0" w:type="dxa"/>
-            <w:bottom w:w="0" w:type="dxa"/>
-          </w:tblCellMar>
-        </w:tblPrEx>
         <w:tc>
           <w:tcPr>
             <w:tcW w:w="2500" w:type="dxa"/>
@@ -134,34 +120,12 @@
                 <w:sz w:val="20"/>
                 <w:szCs w:val="20"/>
               </w:rPr>
-              <w:t xml:space="preserve">Claude, ChatGPT, Stable Diffusion, </w:t>
-            </w:r>
-            <w:proofErr w:type="spellStart"/>
-            <w:r>
-              <w:rPr>
-                <w:sz w:val="20"/>
-                <w:szCs w:val="20"/>
-              </w:rPr>
-              <w:t>ComfyUI</w:t>
-            </w:r>
-            <w:proofErr w:type="spellEnd"/>
-            <w:r>
-              <w:rPr>
-                <w:sz w:val="20"/>
-                <w:szCs w:val="20"/>
-              </w:rPr>
-              <w:t>, Prompt Engineering, LLM APIs</w:t>
+              <w:t>Claude, ChatGPT, Stable Diffusion, ComfyUI, Prompt Engineering, LLM APIs</w:t>
             </w:r>
           </w:p>
         </w:tc>
       </w:tr>
       <w:tr>
-        <w:tblPrEx>
-          <w:tblCellMar>
-            <w:top w:w="0" w:type="dxa"/>
-            <w:bottom w:w="0" w:type="dxa"/>
-          </w:tblCellMar>
-        </w:tblPrEx>
         <w:tc>
           <w:tcPr>
             <w:tcW w:w="2500" w:type="dxa"/>
@@ -201,12 +165,6 @@
         </w:tc>
       </w:tr>
       <w:tr>
-        <w:tblPrEx>
-          <w:tblCellMar>
-            <w:top w:w="0" w:type="dxa"/>
-            <w:bottom w:w="0" w:type="dxa"/>
-          </w:tblCellMar>
-        </w:tblPrEx>
         <w:tc>
           <w:tcPr>
             <w:tcW w:w="2500" w:type="dxa"/>
@@ -246,12 +204,6 @@
         </w:tc>
       </w:tr>
       <w:tr>
-        <w:tblPrEx>
-          <w:tblCellMar>
-            <w:top w:w="0" w:type="dxa"/>
-            <w:bottom w:w="0" w:type="dxa"/>
-          </w:tblCellMar>
-        </w:tblPrEx>
         <w:tc>
           <w:tcPr>
             <w:tcW w:w="2500" w:type="dxa"/>
@@ -291,12 +243,6 @@
         </w:tc>
       </w:tr>
       <w:tr>
-        <w:tblPrEx>
-          <w:tblCellMar>
-            <w:top w:w="0" w:type="dxa"/>
-            <w:bottom w:w="0" w:type="dxa"/>
-          </w:tblCellMar>
-        </w:tblPrEx>
         <w:tc>
           <w:tcPr>
             <w:tcW w:w="2500" w:type="dxa"/>
@@ -336,12 +282,6 @@
         </w:tc>
       </w:tr>
       <w:tr>
-        <w:tblPrEx>
-          <w:tblCellMar>
-            <w:top w:w="0" w:type="dxa"/>
-            <w:bottom w:w="0" w:type="dxa"/>
-          </w:tblCellMar>
-        </w:tblPrEx>
         <w:tc>
           <w:tcPr>
             <w:tcW w:w="2500" w:type="dxa"/>
@@ -381,22 +321,13 @@
         </w:tc>
       </w:tr>
       <w:tr>
-        <w:tblPrEx>
-          <w:tblCellMar>
-            <w:top w:w="0" w:type="dxa"/>
-            <w:bottom w:w="0" w:type="dxa"/>
-          </w:tblCellMar>
-        </w:tblPrEx>
         <w:tc>
           <w:tcPr>
             <w:tcW w:w="2500" w:type="dxa"/>
           </w:tcPr>
           <w:p>
             <w:r>
-              <w:t xml:space="preserve"> </w:t>
-            </w:r>
-            <w:r>
-              <w:t>DevOps/Cloud</w:t>
+              <w:t xml:space="preserve"> DevOps/Cloud</w:t>
             </w:r>
           </w:p>
         </w:tc>
@@ -409,48 +340,19 @@
               <w:rPr>
                 <w:sz w:val="20"/>
               </w:rPr>
-              <w:t xml:space="preserve">  </w:t>
-            </w:r>
-            <w:r>
-              <w:rPr>
-                <w:sz w:val="20"/>
-              </w:rPr>
-              <w:t xml:space="preserve">Docker, Git, GitLab, Google Cloud, </w:t>
-            </w:r>
-            <w:proofErr w:type="spellStart"/>
-            <w:r>
-              <w:rPr>
-                <w:sz w:val="20"/>
-              </w:rPr>
-              <w:t>DigitalOcean</w:t>
-            </w:r>
-            <w:proofErr w:type="spellEnd"/>
-            <w:r>
-              <w:rPr>
-                <w:sz w:val="20"/>
-              </w:rPr>
-              <w:t>, VPS, Linux</w:t>
+              <w:t xml:space="preserve">  Docker, Git, GitLab, Google Cloud, DigitalOcean, VPS, Linux</w:t>
             </w:r>
           </w:p>
         </w:tc>
       </w:tr>
       <w:tr>
-        <w:tblPrEx>
-          <w:tblCellMar>
-            <w:top w:w="0" w:type="dxa"/>
-            <w:bottom w:w="0" w:type="dxa"/>
-          </w:tblCellMar>
-        </w:tblPrEx>
         <w:tc>
           <w:tcPr>
             <w:tcW w:w="2500" w:type="dxa"/>
           </w:tcPr>
           <w:p>
             <w:r>
-              <w:t xml:space="preserve"> </w:t>
-            </w:r>
-            <w:r>
-              <w:t>Dev Tools</w:t>
+              <w:t xml:space="preserve"> Dev Tools</w:t>
             </w:r>
           </w:p>
         </w:tc>
@@ -463,13 +365,7 @@
               <w:rPr>
                 <w:sz w:val="20"/>
               </w:rPr>
-              <w:t xml:space="preserve">  </w:t>
-            </w:r>
-            <w:r>
-              <w:rPr>
-                <w:sz w:val="20"/>
-              </w:rPr>
-              <w:t>VS Code, Cursor, Figma, Postman, Terminal/CLI</w:t>
+              <w:t xml:space="preserve">  VS Code, Cursor, Figma, Postman, Terminal/CLI</w:t>
             </w:r>
           </w:p>
         </w:tc>
@@ -625,15 +521,7 @@
         </w:numPr>
       </w:pPr>
       <w:r>
-        <w:t xml:space="preserve">Implemented AI avatar generation pipeline using </w:t>
-      </w:r>
-      <w:proofErr w:type="spellStart"/>
-      <w:r>
-        <w:t>ComfyUI</w:t>
-      </w:r>
-      <w:proofErr w:type="spellEnd"/>
-      <w:r>
-        <w:t xml:space="preserve"> and Stable Diffusion workflows</w:t>
+        <w:t>Implemented AI avatar generation pipeline using ComfyUI and Stable Diffusion workflows</w:t>
       </w:r>
     </w:p>
     <w:p>
@@ -681,15 +569,7 @@
         </w:numPr>
       </w:pPr>
       <w:r>
-        <w:t xml:space="preserve">Built custom </w:t>
-      </w:r>
-      <w:proofErr w:type="spellStart"/>
-      <w:r>
-        <w:t>ComfyUI</w:t>
-      </w:r>
-      <w:proofErr w:type="spellEnd"/>
-      <w:r>
-        <w:t xml:space="preserve"> pipelines for batch image processing and style consistency</w:t>
+        <w:t>Built custom ComfyUI pipelines for batch image processing and style consistency</w:t>
       </w:r>
     </w:p>
     <w:p>
@@ -725,23 +605,7 @@
           <w:b/>
           <w:bCs/>
         </w:rPr>
-        <w:t xml:space="preserve">Crypto </w:t>
-      </w:r>
-      <w:proofErr w:type="spellStart"/>
-      <w:r>
-        <w:rPr>
-          <w:b/>
-          <w:bCs/>
-        </w:rPr>
-        <w:t>DApps</w:t>
-      </w:r>
-      <w:proofErr w:type="spellEnd"/>
-      <w:r>
-        <w:rPr>
-          <w:b/>
-          <w:bCs/>
-        </w:rPr>
-        <w:t xml:space="preserve"> &amp; Cloud Infrastructure</w:t>
+        <w:t>Crypto DApps &amp; Cloud Infrastructure</w:t>
       </w:r>
     </w:p>
     <w:p>
@@ -765,15 +629,7 @@
         </w:numPr>
       </w:pPr>
       <w:r>
-        <w:t>Containerized applications with Docker for consistent deployment on cloud VPS (</w:t>
-      </w:r>
-      <w:proofErr w:type="spellStart"/>
-      <w:r>
-        <w:t>DigitalOcean</w:t>
-      </w:r>
-      <w:proofErr w:type="spellEnd"/>
-      <w:r>
-        <w:t>, Google Cloud)</w:t>
+        <w:t>Containerized applications with Docker for consistent deployment on cloud VPS (DigitalOcean, Google Cloud)</w:t>
       </w:r>
     </w:p>
     <w:p>
@@ -1673,6 +1529,18 @@
       <w:szCs w:val="20"/>
     </w:rPr>
   </w:style>
+  <w:style w:type="character" w:styleId="UnresolvedMention">
+    <w:name w:val="Unresolved Mention"/>
+    <w:basedOn w:val="DefaultParagraphFont"/>
+    <w:uiPriority w:val="99"/>
+    <w:semiHidden/>
+    <w:unhideWhenUsed/>
+    <w:rsid w:val="007722CE"/>
+    <w:rPr>
+      <w:color w:val="605E5C"/>
+      <w:shd w:val="clear" w:color="auto" w:fill="E1DFDD"/>
+    </w:rPr>
+  </w:style>
 </w:styles>
 </file>
 

</xml_diff>

<commit_message>
Update downloadable resume with RecodeAI project
Co-Authored-By: Claude Opus 4.6 <noreply@anthropic.com>
</commit_message>
<xml_diff>
--- a/Kim_Julongbayan_Resume.docx
+++ b/Kim_Julongbayan_Resume.docx
@@ -111,7 +111,7 @@
     </w:p>
     <w:p>
       <w:pPr>
-        <w:spacing w:line="240" w:lineRule="auto"/>
+        <w:spacing w:after="120" w:line="240" w:lineRule="auto"/>
       </w:pPr>
       <w:r>
         <w:rPr>
@@ -124,7 +124,7 @@
     <w:p>
       <w:pPr>
         <w:pStyle w:val="ListBullet"/>
-        <w:spacing w:line="240" w:lineRule="auto"/>
+        <w:spacing w:after="120" w:line="240" w:lineRule="auto"/>
       </w:pPr>
       <w:r>
         <w:rPr>
@@ -136,7 +136,7 @@
     <w:p>
       <w:pPr>
         <w:pStyle w:val="ListBullet"/>
-        <w:spacing w:line="240" w:lineRule="auto"/>
+        <w:spacing w:after="120" w:line="240" w:lineRule="auto"/>
       </w:pPr>
       <w:r>
         <w:rPr>
@@ -148,7 +148,7 @@
     <w:p>
       <w:pPr>
         <w:pStyle w:val="ListBullet"/>
-        <w:spacing w:line="240" w:lineRule="auto"/>
+        <w:spacing w:after="120" w:line="240" w:lineRule="auto"/>
       </w:pPr>
       <w:r>
         <w:rPr>
@@ -159,7 +159,12 @@
     </w:p>
     <w:p>
       <w:pPr>
-        <w:spacing w:line="240" w:lineRule="auto"/>
+        <w:pStyle w:val="ListBullet"/>
+        <w:numPr>
+          <w:ilvl w:val="0"/>
+          <w:numId w:val="0"/>
+        </w:numPr>
+        <w:spacing w:after="120" w:line="240" w:lineRule="auto"/>
       </w:pPr>
       <w:r>
         <w:rPr>
@@ -172,7 +177,7 @@
     <w:p>
       <w:pPr>
         <w:pStyle w:val="ListBullet"/>
-        <w:spacing w:line="240" w:lineRule="auto"/>
+        <w:spacing w:after="120" w:line="240" w:lineRule="auto"/>
       </w:pPr>
       <w:r>
         <w:rPr>
@@ -184,7 +189,7 @@
     <w:p>
       <w:pPr>
         <w:pStyle w:val="ListBullet"/>
-        <w:spacing w:line="240" w:lineRule="auto"/>
+        <w:spacing w:after="120" w:line="240" w:lineRule="auto"/>
       </w:pPr>
       <w:r>
         <w:rPr>
@@ -196,7 +201,7 @@
     <w:p>
       <w:pPr>
         <w:pStyle w:val="ListBullet"/>
-        <w:spacing w:line="240" w:lineRule="auto"/>
+        <w:spacing w:after="120" w:line="240" w:lineRule="auto"/>
       </w:pPr>
       <w:r>
         <w:rPr>
@@ -207,7 +212,12 @@
     </w:p>
     <w:p>
       <w:pPr>
-        <w:spacing w:line="240" w:lineRule="auto"/>
+        <w:pStyle w:val="ListBullet"/>
+        <w:numPr>
+          <w:ilvl w:val="0"/>
+          <w:numId w:val="0"/>
+        </w:numPr>
+        <w:spacing w:after="120" w:line="240" w:lineRule="auto"/>
       </w:pPr>
       <w:r>
         <w:rPr>
@@ -219,7 +229,7 @@
     </w:p>
     <w:p>
       <w:pPr>
-        <w:spacing w:line="240" w:lineRule="auto"/>
+        <w:spacing w:after="120" w:line="240" w:lineRule="auto"/>
       </w:pPr>
       <w:hyperlink r:id="rId9" w:history="1">
         <w:r>
@@ -227,42 +237,26 @@
             <w:rStyle w:val="Hyperlink"/>
             <w:b/>
           </w:rPr>
-          <w:t>Wor</w:t>
-        </w:r>
-        <w:r>
-          <w:rPr>
-            <w:rStyle w:val="Hyperlink"/>
-            <w:b/>
-          </w:rPr>
-          <w:t>d</w:t>
-        </w:r>
-        <w:r>
-          <w:rPr>
-            <w:rStyle w:val="Hyperlink"/>
-            <w:b/>
-          </w:rPr>
-          <w:t>W</w:t>
-        </w:r>
-        <w:r>
-          <w:rPr>
-            <w:rStyle w:val="Hyperlink"/>
-            <w:b/>
-          </w:rPr>
-          <w:t>a</w:t>
-        </w:r>
-        <w:r>
-          <w:rPr>
-            <w:rStyle w:val="Hyperlink"/>
-            <w:b/>
-          </w:rPr>
-          <w:t>rz.io</w:t>
+          <w:t>WordWarz.io</w:t>
         </w:r>
       </w:hyperlink>
       <w:r>
         <w:rPr>
           <w:b/>
         </w:rPr>
-        <w:t xml:space="preserve"> —Real-Time Multiplayer Game</w:t>
+        <w:t xml:space="preserve"> </w:t>
+      </w:r>
+      <w:r>
+        <w:rPr>
+          <w:b/>
+        </w:rPr>
+        <w:t xml:space="preserve">- </w:t>
+      </w:r>
+      <w:r>
+        <w:rPr>
+          <w:b/>
+        </w:rPr>
+        <w:t>Real-Time Multiplayer Game</w:t>
       </w:r>
       <w:r>
         <w:rPr>
@@ -274,7 +268,7 @@
     <w:p>
       <w:pPr>
         <w:pStyle w:val="ListBullet"/>
-        <w:spacing w:line="240" w:lineRule="auto"/>
+        <w:spacing w:after="120" w:line="240" w:lineRule="auto"/>
         <w:rPr>
           <w:sz w:val="20"/>
           <w:szCs w:val="20"/>
@@ -310,7 +304,7 @@
     <w:p>
       <w:pPr>
         <w:pStyle w:val="ListBullet"/>
-        <w:spacing w:line="240" w:lineRule="auto"/>
+        <w:spacing w:after="120" w:line="240" w:lineRule="auto"/>
         <w:rPr>
           <w:sz w:val="20"/>
           <w:szCs w:val="20"/>
@@ -327,7 +321,7 @@
     <w:p>
       <w:pPr>
         <w:pStyle w:val="ListBullet"/>
-        <w:spacing w:line="240" w:lineRule="auto"/>
+        <w:spacing w:after="120" w:line="240" w:lineRule="auto"/>
         <w:rPr>
           <w:sz w:val="20"/>
           <w:szCs w:val="20"/>
@@ -344,7 +338,7 @@
     <w:p>
       <w:pPr>
         <w:pStyle w:val="ListBullet"/>
-        <w:spacing w:line="240" w:lineRule="auto"/>
+        <w:spacing w:after="120" w:line="240" w:lineRule="auto"/>
       </w:pPr>
       <w:r>
         <w:rPr>
@@ -356,7 +350,7 @@
     <w:p>
       <w:pPr>
         <w:pStyle w:val="ListBullet"/>
-        <w:spacing w:line="240" w:lineRule="auto"/>
+        <w:spacing w:after="120" w:line="240" w:lineRule="auto"/>
       </w:pPr>
       <w:r>
         <w:rPr>
@@ -367,7 +361,7 @@
     </w:p>
     <w:p>
       <w:pPr>
-        <w:spacing w:line="240" w:lineRule="auto"/>
+        <w:spacing w:after="120" w:line="240" w:lineRule="auto"/>
       </w:pPr>
       <w:hyperlink r:id="rId10" w:history="1">
         <w:r>
@@ -382,7 +376,19 @@
         <w:rPr>
           <w:b/>
         </w:rPr>
-        <w:t xml:space="preserve"> — Blockchain </w:t>
+        <w:t xml:space="preserve"> </w:t>
+      </w:r>
+      <w:r>
+        <w:rPr>
+          <w:b/>
+        </w:rPr>
+        <w:t>-</w:t>
+      </w:r>
+      <w:r>
+        <w:rPr>
+          <w:b/>
+        </w:rPr>
+        <w:t xml:space="preserve"> Blockchain </w:t>
       </w:r>
       <w:proofErr w:type="spellStart"/>
       <w:r>
@@ -402,7 +408,7 @@
     <w:p>
       <w:pPr>
         <w:pStyle w:val="ListBullet"/>
-        <w:spacing w:line="240" w:lineRule="auto"/>
+        <w:spacing w:after="120" w:line="240" w:lineRule="auto"/>
       </w:pPr>
       <w:r>
         <w:rPr>
@@ -414,7 +420,7 @@
     <w:p>
       <w:pPr>
         <w:pStyle w:val="ListBullet"/>
-        <w:spacing w:line="240" w:lineRule="auto"/>
+        <w:spacing w:after="120" w:line="240" w:lineRule="auto"/>
       </w:pPr>
       <w:r>
         <w:rPr>
@@ -425,9 +431,118 @@
     </w:p>
     <w:p>
       <w:pPr>
-        <w:spacing w:line="240" w:lineRule="auto"/>
+        <w:spacing w:after="120" w:line="240" w:lineRule="auto"/>
       </w:pPr>
       <w:hyperlink r:id="rId11" w:history="1">
+        <w:proofErr w:type="spellStart"/>
+        <w:r>
+          <w:rPr>
+            <w:rStyle w:val="Hyperlink"/>
+            <w:b/>
+          </w:rPr>
+          <w:t>RecodeAI</w:t>
+        </w:r>
+        <w:proofErr w:type="spellEnd"/>
+      </w:hyperlink>
+      <w:r>
+        <w:rPr>
+          <w:b/>
+        </w:rPr>
+        <w:t xml:space="preserve"> </w:t>
+      </w:r>
+      <w:r>
+        <w:rPr>
+          <w:b/>
+        </w:rPr>
+        <w:t>-</w:t>
+      </w:r>
+      <w:r>
+        <w:rPr>
+          <w:b/>
+        </w:rPr>
+        <w:t xml:space="preserve"> </w:t>
+      </w:r>
+      <w:r>
+        <w:rPr>
+          <w:b/>
+        </w:rPr>
+        <w:t xml:space="preserve">AI-Powered Website </w:t>
+      </w:r>
+      <w:proofErr w:type="spellStart"/>
+      <w:r>
+        <w:rPr>
+          <w:b/>
+        </w:rPr>
+        <w:t>Redesigner</w:t>
+      </w:r>
+      <w:proofErr w:type="spellEnd"/>
+    </w:p>
+    <w:p>
+      <w:pPr>
+        <w:pStyle w:val="ListBullet"/>
+        <w:spacing w:after="120"/>
+        <w:rPr>
+          <w:sz w:val="20"/>
+        </w:rPr>
+      </w:pPr>
+      <w:r>
+        <w:rPr>
+          <w:sz w:val="20"/>
+        </w:rPr>
+        <w:t>Built full-stack Next.js tool that crawls any website, analyzes brand identity via Claude API, generates a complete</w:t>
+      </w:r>
+    </w:p>
+    <w:p>
+      <w:pPr>
+        <w:pStyle w:val="ListBullet"/>
+        <w:numPr>
+          <w:ilvl w:val="0"/>
+          <w:numId w:val="0"/>
+        </w:numPr>
+        <w:spacing w:after="120"/>
+        <w:ind w:left="360"/>
+      </w:pPr>
+      <w:r>
+        <w:rPr>
+          <w:sz w:val="20"/>
+        </w:rPr>
+        <w:t xml:space="preserve">redesign, and auto-deploys to Netlify </w:t>
+      </w:r>
+      <w:r>
+        <w:rPr>
+          <w:sz w:val="20"/>
+        </w:rPr>
+        <w:t>-</w:t>
+      </w:r>
+      <w:r>
+        <w:rPr>
+          <w:sz w:val="20"/>
+        </w:rPr>
+        <w:t xml:space="preserve"> all streamed in real time via SSE</w:t>
+      </w:r>
+    </w:p>
+    <w:p>
+      <w:pPr>
+        <w:pStyle w:val="ListBullet"/>
+        <w:spacing w:after="120"/>
+        <w:rPr>
+          <w:sz w:val="20"/>
+          <w:szCs w:val="20"/>
+        </w:rPr>
+      </w:pPr>
+      <w:r>
+        <w:rPr>
+          <w:sz w:val="20"/>
+          <w:szCs w:val="20"/>
+        </w:rPr>
+        <w:t>Engineered chained LLM inference pipeline with structured output parsing and multi-file code generation.</w:t>
+      </w:r>
+    </w:p>
+    <w:p>
+      <w:pPr>
+        <w:spacing w:after="120" w:line="240" w:lineRule="auto"/>
+      </w:pPr>
+      <w:hyperlink r:id="rId12" w:history="1">
         <w:proofErr w:type="spellStart"/>
         <w:r>
           <w:rPr>
@@ -442,13 +557,25 @@
         <w:rPr>
           <w:b/>
         </w:rPr>
-        <w:t xml:space="preserve"> — AI-Powered E-Commerce Platform</w:t>
+        <w:t xml:space="preserve"> </w:t>
+      </w:r>
+      <w:r>
+        <w:rPr>
+          <w:b/>
+        </w:rPr>
+        <w:t>-</w:t>
+      </w:r>
+      <w:r>
+        <w:rPr>
+          <w:b/>
+        </w:rPr>
+        <w:t xml:space="preserve"> AI-Powered E-Commerce Platform</w:t>
       </w:r>
     </w:p>
     <w:p>
       <w:pPr>
         <w:pStyle w:val="ListBullet"/>
-        <w:spacing w:line="240" w:lineRule="auto"/>
+        <w:spacing w:after="120" w:line="240" w:lineRule="auto"/>
       </w:pPr>
       <w:r>
         <w:rPr>
@@ -459,7 +586,12 @@
     </w:p>
     <w:p>
       <w:pPr>
-        <w:spacing w:line="240" w:lineRule="auto"/>
+        <w:pStyle w:val="ListBullet"/>
+        <w:numPr>
+          <w:ilvl w:val="0"/>
+          <w:numId w:val="0"/>
+        </w:numPr>
+        <w:spacing w:after="120" w:line="240" w:lineRule="auto"/>
       </w:pPr>
       <w:r>
         <w:rPr>
@@ -471,7 +603,7 @@
     </w:p>
     <w:p>
       <w:pPr>
-        <w:spacing w:line="240" w:lineRule="auto"/>
+        <w:spacing w:after="120" w:line="240" w:lineRule="auto"/>
       </w:pPr>
       <w:r>
         <w:rPr>
@@ -483,7 +615,7 @@
     <w:p>
       <w:pPr>
         <w:pStyle w:val="ListBullet"/>
-        <w:spacing w:line="240" w:lineRule="auto"/>
+        <w:spacing w:after="120" w:line="240" w:lineRule="auto"/>
       </w:pPr>
       <w:r>
         <w:rPr>
@@ -495,7 +627,7 @@
     <w:p>
       <w:pPr>
         <w:pStyle w:val="ListBullet"/>
-        <w:spacing w:line="240" w:lineRule="auto"/>
+        <w:spacing w:after="120" w:line="240" w:lineRule="auto"/>
       </w:pPr>
       <w:r>
         <w:rPr>
@@ -507,7 +639,7 @@
     <w:p>
       <w:pPr>
         <w:pStyle w:val="ListBullet"/>
-        <w:spacing w:line="240" w:lineRule="auto"/>
+        <w:spacing w:after="120" w:line="240" w:lineRule="auto"/>
       </w:pPr>
       <w:r>
         <w:rPr>
@@ -518,7 +650,7 @@
     </w:p>
     <w:p>
       <w:pPr>
-        <w:spacing w:line="240" w:lineRule="auto"/>
+        <w:spacing w:after="120" w:line="240" w:lineRule="auto"/>
       </w:pPr>
       <w:r>
         <w:rPr>
@@ -531,7 +663,7 @@
     <w:p>
       <w:pPr>
         <w:pStyle w:val="ListBullet"/>
-        <w:spacing w:line="240" w:lineRule="auto"/>
+        <w:spacing w:after="120" w:line="240" w:lineRule="auto"/>
       </w:pPr>
       <w:r>
         <w:rPr>

</xml_diff>

<commit_message>
Update portfolio to match new CV, add Job Email Watcher project
- Update resume PDF/DOCX assets to latest version
- Add Job Email Watcher project card with n8n workflow screenshot
- Update hero, about, and experience sections to match new CV
- Consolidate experience timeline to single entry + education
- Update stats from 7+ to 5+ years, footer to 2026

Co-Authored-By: Claude Opus 4.6 <noreply@anthropic.com>
</commit_message>
<xml_diff>
--- a/Kim_Julongbayan_Resume.docx
+++ b/Kim_Julongbayan_Resume.docx
@@ -44,7 +44,6 @@
         <w:t xml:space="preserve">Portfolio: </w:t>
       </w:r>
       <w:hyperlink r:id="rId6" w:history="1">
-        <w:proofErr w:type="spellStart"/>
         <w:r>
           <w:rPr>
             <w:rStyle w:val="Hyperlink"/>
@@ -52,7 +51,6 @@
           </w:rPr>
           <w:t>kimlj.dev</w:t>
         </w:r>
-        <w:proofErr w:type="spellEnd"/>
       </w:hyperlink>
       <w:r>
         <w:rPr>
@@ -72,17 +70,8 @@
             <w:rStyle w:val="Hyperlink"/>
             <w:sz w:val="18"/>
           </w:rPr>
-          <w:t>github.com/</w:t>
+          <w:t>github.com/kimlj</w:t>
         </w:r>
-        <w:proofErr w:type="spellStart"/>
-        <w:r>
-          <w:rPr>
-            <w:rStyle w:val="Hyperlink"/>
-            <w:sz w:val="18"/>
-          </w:rPr>
-          <w:t>kimlj</w:t>
-        </w:r>
-        <w:proofErr w:type="spellEnd"/>
       </w:hyperlink>
       <w:r>
         <w:rPr>
@@ -96,17 +85,8 @@
             <w:rStyle w:val="Hyperlink"/>
             <w:sz w:val="18"/>
           </w:rPr>
-          <w:t>linkedin.com/in/</w:t>
+          <w:t>linkedin.com/in/kimjulongbayan</w:t>
         </w:r>
-        <w:proofErr w:type="spellStart"/>
-        <w:r>
-          <w:rPr>
-            <w:rStyle w:val="Hyperlink"/>
-            <w:sz w:val="18"/>
-          </w:rPr>
-          <w:t>kimjulongbayan</w:t>
-        </w:r>
-        <w:proofErr w:type="spellEnd"/>
       </w:hyperlink>
     </w:p>
     <w:p>
@@ -369,113 +349,21 @@
             <w:rStyle w:val="Hyperlink"/>
             <w:b/>
           </w:rPr>
-          <w:t>Casinore.io</w:t>
+          <w:t>RecodeAI</w:t>
         </w:r>
       </w:hyperlink>
       <w:r>
         <w:rPr>
           <w:b/>
         </w:rPr>
-        <w:t xml:space="preserve"> </w:t>
+        <w:t xml:space="preserve"> - </w:t>
       </w:r>
       <w:r>
         <w:rPr>
           <w:b/>
         </w:rPr>
-        <w:t>-</w:t>
+        <w:t>AI-Powered Website Redesigner</w:t>
       </w:r>
-      <w:r>
-        <w:rPr>
-          <w:b/>
-        </w:rPr>
-        <w:t xml:space="preserve"> Blockchain </w:t>
-      </w:r>
-      <w:proofErr w:type="spellStart"/>
-      <w:r>
-        <w:rPr>
-          <w:b/>
-        </w:rPr>
-        <w:t>DApp</w:t>
-      </w:r>
-      <w:proofErr w:type="spellEnd"/>
-      <w:r>
-        <w:rPr>
-          <w:b/>
-        </w:rPr>
-        <w:t xml:space="preserve"> (Solana)</w:t>
-      </w:r>
-    </w:p>
-    <w:p>
-      <w:pPr>
-        <w:pStyle w:val="ListBullet"/>
-        <w:spacing w:after="120" w:line="240" w:lineRule="auto"/>
-      </w:pPr>
-      <w:r>
-        <w:rPr>
-          <w:sz w:val="20"/>
-        </w:rPr>
-        <w:t>Developed React/Next.js decentralized application with wallet authentication and on-chain transactions.</w:t>
-      </w:r>
-    </w:p>
-    <w:p>
-      <w:pPr>
-        <w:pStyle w:val="ListBullet"/>
-        <w:spacing w:after="120" w:line="240" w:lineRule="auto"/>
-      </w:pPr>
-      <w:r>
-        <w:rPr>
-          <w:sz w:val="20"/>
-        </w:rPr>
-        <w:t>Deployed Dockerized infrastructure on Google Cloud and VPS with automated CI/CD pipelines.</w:t>
-      </w:r>
-    </w:p>
-    <w:p>
-      <w:pPr>
-        <w:spacing w:after="120" w:line="240" w:lineRule="auto"/>
-      </w:pPr>
-      <w:hyperlink r:id="rId11" w:history="1">
-        <w:proofErr w:type="spellStart"/>
-        <w:r>
-          <w:rPr>
-            <w:rStyle w:val="Hyperlink"/>
-            <w:b/>
-          </w:rPr>
-          <w:t>RecodeAI</w:t>
-        </w:r>
-        <w:proofErr w:type="spellEnd"/>
-      </w:hyperlink>
-      <w:r>
-        <w:rPr>
-          <w:b/>
-        </w:rPr>
-        <w:t xml:space="preserve"> </w:t>
-      </w:r>
-      <w:r>
-        <w:rPr>
-          <w:b/>
-        </w:rPr>
-        <w:t>-</w:t>
-      </w:r>
-      <w:r>
-        <w:rPr>
-          <w:b/>
-        </w:rPr>
-        <w:t xml:space="preserve"> </w:t>
-      </w:r>
-      <w:r>
-        <w:rPr>
-          <w:b/>
-        </w:rPr>
-        <w:t xml:space="preserve">AI-Powered Website </w:t>
-      </w:r>
-      <w:proofErr w:type="spellStart"/>
-      <w:r>
-        <w:rPr>
-          <w:b/>
-        </w:rPr>
-        <w:t>Redesigner</w:t>
-      </w:r>
-      <w:proofErr w:type="spellEnd"/>
     </w:p>
     <w:p>
       <w:pPr>
@@ -540,36 +428,88 @@
     </w:p>
     <w:p>
       <w:pPr>
+        <w:pStyle w:val="ListBullet"/>
+        <w:numPr>
+          <w:ilvl w:val="0"/>
+          <w:numId w:val="0"/>
+        </w:numPr>
+        <w:spacing w:after="120"/>
+        <w:ind w:left="360"/>
+        <w:rPr>
+          <w:sz w:val="20"/>
+          <w:szCs w:val="20"/>
+        </w:rPr>
+      </w:pPr>
+    </w:p>
+    <w:p>
+      <w:pPr>
+        <w:pStyle w:val="ListBullet"/>
+        <w:numPr>
+          <w:ilvl w:val="0"/>
+          <w:numId w:val="0"/>
+        </w:numPr>
+      </w:pPr>
+      <w:r>
+        <w:rPr>
+          <w:b/>
+        </w:rPr>
+        <w:t>Job Email Watcher</w:t>
+      </w:r>
+      <w:r>
+        <w:t xml:space="preserve"> - </w:t>
+      </w:r>
+      <w:r>
+        <w:t>AI Job Alert Automation Pipeline</w:t>
+      </w:r>
+    </w:p>
+    <w:p>
+      <w:pPr>
+        <w:pStyle w:val="ListBullet"/>
+        <w:rPr>
+          <w:sz w:val="20"/>
+          <w:szCs w:val="20"/>
+        </w:rPr>
+      </w:pPr>
+      <w:r>
+        <w:rPr>
+          <w:sz w:val="20"/>
+          <w:szCs w:val="20"/>
+        </w:rPr>
+        <w:t>Built end-to-end n8n job alert pipeline automating Gmail extraction, GPT-4o resume scoring with hybrid AI + code</w:t>
+      </w:r>
+      <w:r>
+        <w:rPr>
+          <w:sz w:val="20"/>
+          <w:szCs w:val="20"/>
+        </w:rPr>
+        <w:t xml:space="preserve"> </w:t>
+      </w:r>
+      <w:r>
+        <w:rPr>
+          <w:sz w:val="20"/>
+          <w:szCs w:val="20"/>
+        </w:rPr>
+        <w:t>salary algorithm, Google Sheets logging, and Telegram notifications</w:t>
+      </w:r>
+    </w:p>
+    <w:p>
+      <w:pPr>
         <w:spacing w:after="120" w:line="240" w:lineRule="auto"/>
       </w:pPr>
-      <w:hyperlink r:id="rId12" w:history="1">
-        <w:proofErr w:type="spellStart"/>
+      <w:hyperlink r:id="rId11" w:history="1">
         <w:r>
           <w:rPr>
             <w:rStyle w:val="Hyperlink"/>
             <w:b/>
           </w:rPr>
-          <w:t>kikoysbike.app</w:t>
+          <w:t>Casinore.io</w:t>
         </w:r>
-        <w:proofErr w:type="spellEnd"/>
       </w:hyperlink>
       <w:r>
         <w:rPr>
           <w:b/>
         </w:rPr>
-        <w:t xml:space="preserve"> </w:t>
-      </w:r>
-      <w:r>
-        <w:rPr>
-          <w:b/>
-        </w:rPr>
-        <w:t>-</w:t>
-      </w:r>
-      <w:r>
-        <w:rPr>
-          <w:b/>
-        </w:rPr>
-        <w:t xml:space="preserve"> AI-Powered E-Commerce Platform</w:t>
+        <w:t xml:space="preserve"> - Blockchain DApp (Solana)</w:t>
       </w:r>
     </w:p>
     <w:p>
@@ -581,7 +521,19 @@
         <w:rPr>
           <w:sz w:val="20"/>
         </w:rPr>
-        <w:t>Built full-stack e-commerce platform with OpenAI-powered recommendation chatbot for personalized bike configuration.</w:t>
+        <w:t>Developed React/Next.js decentralized application with wallet authentication and on-chain transactions.</w:t>
+      </w:r>
+    </w:p>
+    <w:p>
+      <w:pPr>
+        <w:pStyle w:val="ListBullet"/>
+        <w:spacing w:after="120" w:line="240" w:lineRule="auto"/>
+      </w:pPr>
+      <w:r>
+        <w:rPr>
+          <w:sz w:val="20"/>
+        </w:rPr>
+        <w:t>Deployed Dockerized infrastructure on Google Cloud and VPS with automated CI/CD pipelines.</w:t>
       </w:r>
     </w:p>
     <w:p>

</xml_diff>

<commit_message>
Update titles to Developer, add on-and-off experience framing, update resumes
- Change Full Stack Engineer → Full Stack Developer across portfolio
- Add "on-and-off experience building independent projects" framing
- Update resume PDF and DOCX with matching changes
- Add AI-focused resume variants (docx + pdf)

Co-Authored-By: Claude Opus 4.6 <noreply@anthropic.com>
</commit_message>
<xml_diff>
--- a/Kim_Julongbayan_Resume.docx
+++ b/Kim_Julongbayan_Resume.docx
@@ -22,7 +22,31 @@
         <w:rPr>
           <w:sz w:val="18"/>
         </w:rPr>
-        <w:t>Full Stack Engineer | AI Engineer | Backend Systems</w:t>
+        <w:t>Full Stack</w:t>
+      </w:r>
+      <w:r>
+        <w:rPr>
+          <w:sz w:val="18"/>
+        </w:rPr>
+        <w:t xml:space="preserve"> Developer</w:t>
+      </w:r>
+      <w:r>
+        <w:rPr>
+          <w:sz w:val="18"/>
+        </w:rPr>
+        <w:t xml:space="preserve"> | AI</w:t>
+      </w:r>
+      <w:r>
+        <w:rPr>
+          <w:sz w:val="18"/>
+        </w:rPr>
+        <w:t xml:space="preserve"> Developer</w:t>
+      </w:r>
+      <w:r>
+        <w:rPr>
+          <w:sz w:val="18"/>
+        </w:rPr>
+        <w:t xml:space="preserve"> | Backend Systems</w:t>
       </w:r>
       <w:r>
         <w:rPr>
@@ -110,7 +134,31 @@
         <w:rPr>
           <w:sz w:val="20"/>
         </w:rPr>
-        <w:t>Full Stack Engineer with 5+ years of experience building scalable web, mobile, and AI-integrated systems.</w:t>
+        <w:t xml:space="preserve">Full Stack Engineer with 5+ years of </w:t>
+      </w:r>
+      <w:r>
+        <w:rPr>
+          <w:sz w:val="20"/>
+        </w:rPr>
+        <w:t xml:space="preserve">on-and-off </w:t>
+      </w:r>
+      <w:r>
+        <w:rPr>
+          <w:sz w:val="20"/>
+        </w:rPr>
+        <w:t xml:space="preserve">experience building </w:t>
+      </w:r>
+      <w:r>
+        <w:rPr>
+          <w:sz w:val="20"/>
+        </w:rPr>
+        <w:t xml:space="preserve">independent projects - </w:t>
+      </w:r>
+      <w:r>
+        <w:rPr>
+          <w:sz w:val="20"/>
+        </w:rPr>
+        <w:t>scalable web, mobile, and AI-integrated systems.</w:t>
       </w:r>
     </w:p>
     <w:p>
@@ -134,7 +182,13 @@
         <w:rPr>
           <w:sz w:val="20"/>
         </w:rPr>
-        <w:t>Proven ownership of end-to-end system architecture, backend performance optimization, and production infrastructure.</w:t>
+        <w:t>Hands of experience with</w:t>
+      </w:r>
+      <w:r>
+        <w:rPr>
+          <w:sz w:val="20"/>
+        </w:rPr>
+        <w:t xml:space="preserve"> end-to-end system architecture, backend performance optimization, and production infrastructure.</w:t>
       </w:r>
     </w:p>
     <w:p>
@@ -573,7 +627,13 @@
         <w:rPr>
           <w:sz w:val="20"/>
         </w:rPr>
-        <w:t>Designed and deployed production-grade applications across frontend, backend, and database layers.</w:t>
+        <w:t>Self-directed development of independent projects</w:t>
+      </w:r>
+      <w:r>
+        <w:rPr>
+          <w:sz w:val="20"/>
+        </w:rPr>
+        <w:t xml:space="preserve"> across frontend, backend, and database layers.</w:t>
       </w:r>
     </w:p>
     <w:p>

</xml_diff>

<commit_message>
Put the merged pull requests on the resume
Four PRs landed in maintained projects this year - three in recharts, one in
mastra - each reviewed by a maintainer before merging. None of it was on the
resume, so applications were arguing for work the linked PDF did not carry.
That gap matters more than usual here: kimlj.dev serves this file, and a cover
letter linking it sends the reader from the claim to a document that does not
support it.

The section had to fit without losing a bullet, since this file is the baseline
every tailored variant is built from and a cut here is a cut everywhere. So the
space came from spacing: bullet gaps 6pt to 1.5pt, the redundant blank line
above EDUCATION, and a tenth of an inch off the top and bottom margins. Still
one page, confirmed by rendering rather than assumed.

Co-Authored-By: Claude Opus 5 <noreply@anthropic.com>
Claude-Session: https://claude.ai/code/session_01KazTKRTvtKBbC6fZTcWmmB
</commit_message>
<xml_diff>
--- a/Kim_Julongbayan_Resume.docx
+++ b/Kim_Julongbayan_Resume.docx
@@ -128,7 +128,7 @@
     <w:p>
       <w:pPr>
         <w:pStyle w:val="ListBullet"/>
-        <w:spacing w:after="120" w:line="240" w:lineRule="auto"/>
+        <w:spacing w:after="30" w:line="240" w:lineRule="auto"/>
       </w:pPr>
       <w:r>
         <w:rPr>
@@ -140,7 +140,7 @@
     <w:p>
       <w:pPr>
         <w:pStyle w:val="ListBullet"/>
-        <w:spacing w:after="120" w:line="240" w:lineRule="auto"/>
+        <w:spacing w:after="30" w:line="240" w:lineRule="auto"/>
       </w:pPr>
       <w:r>
         <w:rPr>
@@ -152,7 +152,7 @@
     <w:p>
       <w:pPr>
         <w:pStyle w:val="ListBullet"/>
-        <w:spacing w:after="120" w:line="240" w:lineRule="auto"/>
+        <w:spacing w:after="30" w:line="240" w:lineRule="auto"/>
       </w:pPr>
       <w:r>
         <w:rPr>
@@ -175,7 +175,7 @@
     <w:p>
       <w:pPr>
         <w:pStyle w:val="ListBullet"/>
-        <w:spacing w:after="120" w:line="240" w:lineRule="auto"/>
+        <w:spacing w:after="30" w:line="240" w:lineRule="auto"/>
       </w:pPr>
       <w:r>
         <w:rPr>
@@ -187,7 +187,7 @@
     <w:p>
       <w:pPr>
         <w:pStyle w:val="ListBullet"/>
-        <w:spacing w:after="120" w:line="240" w:lineRule="auto"/>
+        <w:spacing w:after="30" w:line="240" w:lineRule="auto"/>
       </w:pPr>
       <w:r>
         <w:rPr>
@@ -199,7 +199,7 @@
     <w:p>
       <w:pPr>
         <w:pStyle w:val="ListBullet"/>
-        <w:spacing w:after="120" w:line="240" w:lineRule="auto"/>
+        <w:spacing w:after="30" w:line="240" w:lineRule="auto"/>
       </w:pPr>
       <w:r>
         <w:rPr>
@@ -242,7 +242,7 @@
     <w:p>
       <w:pPr>
         <w:pStyle w:val="ListBullet"/>
-        <w:spacing w:after="120" w:line="240" w:lineRule="auto"/>
+        <w:spacing w:after="30" w:line="240" w:lineRule="auto"/>
         <w:rPr>
           <w:sz w:val="20"/>
           <w:szCs w:val="20"/>
@@ -270,7 +270,7 @@
     <w:p>
       <w:pPr>
         <w:pStyle w:val="ListBullet"/>
-        <w:spacing w:after="120" w:line="240" w:lineRule="auto"/>
+        <w:spacing w:after="30" w:line="240" w:lineRule="auto"/>
         <w:rPr>
           <w:sz w:val="20"/>
           <w:szCs w:val="20"/>
@@ -286,7 +286,7 @@
     <w:p>
       <w:pPr>
         <w:pStyle w:val="ListBullet"/>
-        <w:spacing w:after="120" w:line="240" w:lineRule="auto"/>
+        <w:spacing w:after="30" w:line="240" w:lineRule="auto"/>
         <w:rPr>
           <w:sz w:val="20"/>
           <w:szCs w:val="20"/>
@@ -302,7 +302,7 @@
     <w:p>
       <w:pPr>
         <w:pStyle w:val="ListBullet"/>
-        <w:spacing w:after="120" w:line="240" w:lineRule="auto"/>
+        <w:spacing w:after="30" w:line="240" w:lineRule="auto"/>
         <w:rPr>
           <w:sz w:val="20"/>
           <w:szCs w:val="20"/>
@@ -318,7 +318,7 @@
     <w:p>
       <w:pPr>
         <w:pStyle w:val="ListBullet"/>
-        <w:spacing w:after="120" w:line="240" w:lineRule="auto"/>
+        <w:spacing w:after="30" w:line="240" w:lineRule="auto"/>
         <w:rPr>
           <w:sz w:val="20"/>
           <w:szCs w:val="20"/>
@@ -345,7 +345,7 @@
     <w:p>
       <w:pPr>
         <w:pStyle w:val="ListBullet"/>
-        <w:spacing w:after="120" w:line="240" w:lineRule="auto"/>
+        <w:spacing w:after="30" w:line="240" w:lineRule="auto"/>
       </w:pPr>
       <w:r>
         <w:rPr>
@@ -406,7 +406,7 @@
     <w:p>
       <w:pPr>
         <w:pStyle w:val="ListBullet"/>
-        <w:spacing w:after="120" w:line="240" w:lineRule="auto"/>
+        <w:spacing w:after="30" w:line="240" w:lineRule="auto"/>
         <w:rPr>
           <w:sz w:val="20"/>
           <w:szCs w:val="20"/>
@@ -422,7 +422,7 @@
     <w:p>
       <w:pPr>
         <w:pStyle w:val="ListBullet"/>
-        <w:spacing w:after="120" w:line="240" w:lineRule="auto"/>
+        <w:spacing w:after="30" w:line="240" w:lineRule="auto"/>
         <w:rPr>
           <w:sz w:val="20"/>
           <w:szCs w:val="20"/>
@@ -439,7 +439,7 @@
     <w:p>
       <w:pPr>
         <w:pStyle w:val="ListBullet"/>
-        <w:spacing w:after="120" w:line="240" w:lineRule="auto"/>
+        <w:spacing w:after="30" w:line="240" w:lineRule="auto"/>
         <w:rPr>
           <w:sz w:val="20"/>
           <w:szCs w:val="20"/>
@@ -456,7 +456,7 @@
     <w:p>
       <w:pPr>
         <w:pStyle w:val="ListBullet"/>
-        <w:spacing w:after="120" w:line="240" w:lineRule="auto"/>
+        <w:spacing w:after="30" w:line="240" w:lineRule="auto"/>
       </w:pPr>
       <w:r>
         <w:rPr>
@@ -479,6 +479,7 @@
     <w:p>
       <w:pPr>
         <w:pStyle w:val="ListBullet"/>
+        <w:spacing w:after="30"/>
         <w:rPr>
           <w:sz w:val="20"/>
           <w:szCs w:val="20"/>
@@ -500,14 +501,48 @@
         <w:rPr>
           <w:b/>
         </w:rPr>
-        <w:br/>
+        <w:t>OPEN SOURCE CONTRIBUTIONS</w:t>
+      </w:r>
+    </w:p>
+    <w:p>
+      <w:pPr>
+        <w:pStyle w:val="ListBullet"/>
+        <w:spacing w:after="30" w:line="240" w:lineRule="auto"/>
+      </w:pPr>
+      <w:r>
+        <w:rPr>
+          <w:sz w:val="20"/>
+        </w:rPr>
+        <w:t>recharts (3 merged, 2026): XAxis height="auto" sizing, a connectNulls bug across stacked series, and a redundant CartesianAxis dispatch. Each reviewed by a maintainer before landing.</w:t>
+      </w:r>
+    </w:p>
+    <w:p>
+      <w:pPr>
+        <w:pStyle w:val="ListBullet"/>
+        <w:spacing w:after="30" w:line="240" w:lineRule="auto"/>
+      </w:pPr>
+      <w:r>
+        <w:rPr>
+          <w:sz w:val="20"/>
+        </w:rPr>
+        <w:t>mastra (1 merged, 2026): agent model-call retries now honour Retry-After instead of retrying straight back into a rate-limited provider.</w:t>
+      </w:r>
+    </w:p>
+    <w:p>
+      <w:pPr>
+        <w:spacing w:after="120" w:line="240" w:lineRule="auto"/>
+      </w:pPr>
+      <w:r>
+        <w:rPr>
+          <w:b/>
+        </w:rPr>
         <w:t>EDUCATION</w:t>
       </w:r>
     </w:p>
     <w:p>
       <w:pPr>
         <w:pStyle w:val="ListBullet"/>
-        <w:spacing w:after="120" w:line="240" w:lineRule="auto"/>
+        <w:spacing w:after="30" w:line="240" w:lineRule="auto"/>
       </w:pPr>
       <w:r>
         <w:rPr>
@@ -518,7 +553,7 @@
     </w:p>
     <w:sectPr>
       <w:pgSz w:w="12240" w:h="15840"/>
-      <w:pgMar w:top="864" w:right="1152" w:bottom="720" w:left="1152" w:header="720" w:footer="720" w:gutter="0"/>
+      <w:pgMar w:top="720" w:right="1152" w:bottom="600" w:left="1152" w:header="720" w:footer="720" w:gutter="0"/>
       <w:cols w:space="720"/>
       <w:docGrid w:linePitch="360"/>
     </w:sectPr>

</xml_diff>

<commit_message>
List private-repo work as experience, not as familiar
React Native, Expo, Zustand, Prisma, Playwright, Vitest, Solana and
GitHub Actions sat under Also familiar while real repos used every one
of them. They move into the Skills list, marked "private repo" where the
repo is private, behind a new Private repos chip. The groups become
3/7/4/6/6/5, which still lands one pair per column.

MDS Pro now reads 35 RLS policies across 44 migrations, the counted
figure, instead of 37. The master resume cites the size of recharts and
mastra beside the merged PRs.

Co-Authored-By: Claude Opus 5 <noreply@anthropic.com>
</commit_message>
<xml_diff>
--- a/Kim_Julongbayan_Resume.docx
+++ b/Kim_Julongbayan_Resume.docx
@@ -513,7 +513,7 @@
         <w:rPr>
           <w:sz w:val="20"/>
         </w:rPr>
-        <w:t>recharts (3 merged, 2026): XAxis height="auto" sizing, a connectNulls bug across stacked series, and a redundant CartesianAxis dispatch. Each reviewed by a maintainer before landing.</w:t>
+        <w:t>recharts, a charting library with over 27,000 GitHub stars (3 merged, 2026): XAxis height="auto" sizing, a connectNulls bug across stacked series, and a redundant CartesianAxis dispatch. Each reviewed by a maintainer before landing.</w:t>
       </w:r>
     </w:p>
     <w:p>
@@ -525,7 +525,7 @@
         <w:rPr>
           <w:sz w:val="20"/>
         </w:rPr>
-        <w:t>mastra (1 merged, 2026): agent model-call retries now honour Retry-After instead of retrying straight back into a rate-limited provider.</w:t>
+        <w:t>mastra, an AI agent framework with over 27,000 GitHub stars (1 merged, 2026): agent model-call retries now honor Retry-After instead of retrying straight back into a rate-limited provider.</w:t>
       </w:r>
     </w:p>
     <w:p>

</xml_diff>